<commit_message>
Matrix: three salary tiers (net/gross/full cost) with base switcher
- Add per-employee net (на руки), gross/oklad (брутто), full cost (ФОТ) columns
- Base-of-split selector cell (C3): целевой доход и деление 75/25 recompute on chosen tier
- Default base = брутто (contract-correct); net shown for take-home perception
- Docx: note on the three tiers and base choice; clarify oklad goes into contract in gross
- Totals verified: net 16,150,000 / gross 19,834,098 / full 22,280,320

Co-Authored-By: Claude Opus 4.8 <noreply@anthropic.com>
Claude-Session: https://claude.ai/code/session_012ZQtdF2A38HHoNEV3VKJ8F
</commit_message>
<xml_diff>
--- a/motivation/WayStar_Положение_и_показатели.docx
+++ b/motivation/WayStar_Положение_и_показатели.docx
@@ -1339,7 +1339,66 @@
           <w:color w:val="2A3746"/>
           <w:sz w:val="22"/>
         </w:rPr>
-        <w:t>Под результатом — 25% дохода: около 4,96 млн ₸ в месяц (около 59,5 млн ₸ в год). При выполнении на 100% выплачивается полностью (фонд не растёт). По приказу премия не превышает лимит, поэтому верхний предел фонда равен текущему — перерасхода нет; экономия возникает при недовыполнении.</w:t>
+        <w:t>Под результатом — 25% дохода: около 4,96 млн ₸ в месяц (около 59,5 млн ₸ в год, база брутто). При выполнении на 100% выплачивается полностью (фонд не растёт). По приказу премия не превышает лимит, поэтому верхний предел фонда равен текущему — перерасхода нет; экономия возникает при недовыполнении.</w:t>
+      </w:r>
+    </w:p>
+    <w:p>
+      <w:pPr>
+        <w:spacing w:after="120" w:before="0"/>
+      </w:pPr>
+      <w:r>
+        <w:rPr>
+          <w:b/>
+          <w:i w:val="0"/>
+          <w:color w:val="C4772F"/>
+          <w:sz w:val="22"/>
+        </w:rPr>
+        <w:t xml:space="preserve">Три уровня суммы и база деления. </w:t>
+      </w:r>
+      <w:r>
+        <w:rPr>
+          <w:b w:val="0"/>
+          <w:i w:val="0"/>
+          <w:color w:val="2A3746"/>
+          <w:sz w:val="22"/>
+        </w:rPr>
+        <w:t xml:space="preserve">В матрице (Приложение 1) для каждого сотрудника показаны три уровня: </w:t>
+      </w:r>
+      <w:r>
+        <w:rPr>
+          <w:b/>
+          <w:i w:val="0"/>
+          <w:color w:val="13294B"/>
+          <w:sz w:val="22"/>
+        </w:rPr>
+        <w:t>«на руки» (нетто), «брутто/оклад» (начисленный) и «полная стоимость» (ФОТ со всеми налогами)</w:t>
+      </w:r>
+      <w:r>
+        <w:rPr>
+          <w:b w:val="0"/>
+          <w:i w:val="0"/>
+          <w:color w:val="2A3746"/>
+          <w:sz w:val="22"/>
+        </w:rPr>
+        <w:t xml:space="preserve">. База деления 75/25 выбирается ячейкой-переключателем. По умолчанию — </w:t>
+      </w:r>
+      <w:r>
+        <w:rPr>
+          <w:b/>
+          <w:i w:val="0"/>
+          <w:color w:val="13294B"/>
+          <w:sz w:val="22"/>
+        </w:rPr>
+        <w:t>брутто (оклад)</w:t>
+      </w:r>
+      <w:r>
+        <w:rPr>
+          <w:b w:val="0"/>
+          <w:i w:val="0"/>
+          <w:color w:val="2A3746"/>
+          <w:sz w:val="22"/>
+        </w:rPr>
+        <w:t>: именно в брутто оклад указывается в трудовом договоре. Сумма «на руки» приведена для наглядности эффекта в чистых деньгах (переменная часть также облагается налогами). При выборе базы «на руки» оклад (75%) перед договором пересчитывается в брутто.</w:t>
       </w:r>
     </w:p>
     <w:p>

</xml_diff>